<commit_message>
Update licence model and README.md
</commit_message>
<xml_diff>
--- a/Trauma Informed AI Safety Benchmark and Assurance Framework v1.1.docx
+++ b/Trauma Informed AI Safety Benchmark and Assurance Framework v1.1.docx
@@ -674,7 +674,7 @@
                 <w:sz w:val="18"/>
                 <w:szCs w:val="18"/>
               </w:rPr>
-              <w:t xml:space="preserve">Version 1.1, published 21 August 2026. Supersedes version 1.0 (16 August 2026).</w:t>
+              <w:t xml:space="preserve">Version 1.1, published 21 August 2026. Supersedes version 1.0 (16 August 2026). Licence revised 14 September 2026; the normative text is unchanged.</w:t>
             </w:r>
           </w:p>
         </w:tc>
@@ -914,7 +914,7 @@
                 <w:sz w:val="18"/>
                 <w:szCs w:val="18"/>
               </w:rPr>
-              <w:t xml:space="preserve">The Digital Safeguard Centre Framework Licence. The framework may be reproduced and cited with attribution to the Centre. Adopters, including commercial vendors and assessors, may adapt the jurisdiction anchors, risk instruments and seed classes, and author benchmark items on them, for conformance work under this framework. Conformance work, including paid assessment, is a permitted use. Republication of an adapted framework, and any other commercial use such as sale of the document or its incorporation in a paid product, requires written permission. The licence is not a Creative Commons licence. The Centre's own private assurance suite and casework-derived material sit outside it.</w:t>
+              <w:t xml:space="preserve">Creative Commons Attribution 4.0 International (CC BY 4.0). The framework may be shared and adapted, including commercially, provided attribution is given to the Centre, the licence is linked and any changes are indicated. Adaptation of the jurisdiction anchors, risk instruments and seed classes, authoring of benchmark items on them, and conformance work including paid assessment are permitted uses. An adapted framework must not be presented as the Centre's published framework or as carrying the Centre's endorsement. The public benchmark item set is released under the same licence; the benchmark harness and supporting tooling are released separately under the Apache License 2.0. No licence granted here certifies conformance under this framework, and none grants use of the Centre's name or marks. The Centre's own private assurance suite and casework-derived material sit outside this release.</w:t>
             </w:r>
           </w:p>
         </w:tc>
@@ -1539,6 +1539,93 @@
                 <w:szCs w:val="18"/>
               </w:rPr>
               <w:t xml:space="preserve">Version 1.0 was issued to meet a consultation commitment and was revised within the week once a full editorial review was complete. Seed class X007 withdrawn and cultural safety testing moved to the matched-pair class X003. P10 and P15 rewritten so that no pathway is ever withheld on the basis of an attribute and choice stays with the person. Critical set defined. Gate table restructured into absolute, threshold and comparative gates. S1 gate restated as non-inferiority. Judge reliability floor set at alpha 0.80 for all dimensions. Conformance restated as self-assessment at two levels; the independent assurance level removed and the Centre's non-assessor role stated. Private suite defined per adopter. Roles and records section added. Front matter consolidated; standards mapping moved to Part C. Injection payload and bypass detail removed from seed text. X001 reclassified. Duty of candour given a safe-channel clause. References corrected, renumbered and extended.</w:t>
+            </w:r>
+          </w:p>
+        </w:tc>
+      </w:tr>
+      <w:tr>
+        <w:trPr>
+          <w:cantSplit/>
+          <w:tblHeader w:val="false"/>
+        </w:trPr>
+        <w:tc>
+          <w:tcPr>
+            <w:tcW w:type="dxa" w:w="1150"/>
+            <w:tcMar>
+              <w:top w:type="dxa" w:w="70"/>
+              <w:left w:type="dxa" w:w="90"/>
+              <w:bottom w:type="dxa" w:w="70"/>
+              <w:right w:type="dxa" w:w="90"/>
+            </w:tcMar>
+            <w:vAlign w:val="top"/>
+          </w:tcPr>
+          <w:p>
+            <w:pPr>
+              <w:spacing w:after="0" w:line="250"/>
+            </w:pPr>
+            <w:r>
+              <w:rPr>
+                <w:b w:val="false"/>
+                <w:bCs w:val="false"/>
+                <w:color w:val="000000"/>
+                <w:sz w:val="18"/>
+                <w:szCs w:val="18"/>
+              </w:rPr>
+              <w:t xml:space="preserve">1.1</w:t>
+            </w:r>
+          </w:p>
+        </w:tc>
+        <w:tc>
+          <w:tcPr>
+            <w:tcW w:type="dxa" w:w="1150"/>
+            <w:tcMar>
+              <w:top w:type="dxa" w:w="70"/>
+              <w:left w:type="dxa" w:w="90"/>
+              <w:bottom w:type="dxa" w:w="70"/>
+              <w:right w:type="dxa" w:w="90"/>
+            </w:tcMar>
+            <w:vAlign w:val="top"/>
+          </w:tcPr>
+          <w:p>
+            <w:pPr>
+              <w:spacing w:after="0" w:line="250"/>
+            </w:pPr>
+            <w:r>
+              <w:rPr>
+                <w:b w:val="false"/>
+                <w:bCs w:val="false"/>
+                <w:color w:val="000000"/>
+                <w:sz w:val="18"/>
+                <w:szCs w:val="18"/>
+              </w:rPr>
+              <w:t xml:space="preserve">14 September 2026</w:t>
+            </w:r>
+          </w:p>
+        </w:tc>
+        <w:tc>
+          <w:tcPr>
+            <w:tcW w:type="dxa" w:w="7006"/>
+            <w:tcMar>
+              <w:top w:type="dxa" w:w="70"/>
+              <w:left w:type="dxa" w:w="90"/>
+              <w:bottom w:type="dxa" w:w="70"/>
+              <w:right w:type="dxa" w:w="90"/>
+            </w:tcMar>
+            <w:vAlign w:val="top"/>
+          </w:tcPr>
+          <w:p>
+            <w:pPr>
+              <w:spacing w:after="0" w:line="250"/>
+            </w:pPr>
+            <w:r>
+              <w:rPr>
+                <w:b w:val="false"/>
+                <w:bCs w:val="false"/>
+                <w:color w:val="000000"/>
+                <w:sz w:val="18"/>
+                <w:szCs w:val="18"/>
+              </w:rPr>
+              <w:t xml:space="preserve">Licence revision. The framework is released under Creative Commons Attribution 4.0 International (CC BY 4.0) in place of the Digital Safeguard Centre Framework Licence, and the benchmark harness and supporting tooling under the Apache License 2.0. The version number is unchanged because the normative text is unchanged; a claim made against version 1.1 is unaffected.</w:t>
             </w:r>
           </w:p>
         </w:tc>

</xml_diff>